<commit_message>
feat: preparar imágenes centradas y numeración final en plantillas UMSA
</commit_message>
<xml_diff>
--- a/public/downloads/plantillas-um-sans/2026.10.10-r4/ejemplo-licitacion.docx
+++ b/public/downloads/plantillas-um-sans/2026.10.10-r4/ejemplo-licitacion.docx
@@ -339,6 +339,63 @@
     <w:p>
       <w:r>
         <w:t xml:space="preserve">Los equipos de acceso se conectarán al núcleo existente. La configuración separará la operación de la administración y registrará los puertos, las direcciones y los parámetros acordados. El plano final reflejará la instalación ejecutada.</w:t>
+      </w:r>
+    </w:p>
+    <w:p>
+      <w:pPr>
+        <w:pStyle w:val="Imagencentrada"/>
+        <w:keepNext/>
+        <w:spacing w:after="80"/>
+      </w:pPr>
+      <w:r>
+        <w:drawing>
+          <wp:inline xmlns:a="http://schemas.openxmlformats.org/drawingml/2006/main" xmlns:pic="http://schemas.openxmlformats.org/drawingml/2006/picture">
+            <wp:extent cx="3888000" cy="2120727"/>
+            <wp:docPr id="1" name="Picture 1" descr="Ilustración de un panel de conexiones de red sobre fondo transparente" title="1.2.png"/>
+            <wp:cNvGraphicFramePr>
+              <a:graphicFrameLocks noChangeAspect="1"/>
+            </wp:cNvGraphicFramePr>
+            <a:graphic>
+              <a:graphicData uri="http://schemas.openxmlformats.org/drawingml/2006/picture">
+                <pic:pic>
+                  <pic:nvPicPr>
+                    <pic:cNvPr id="0" name="1.2.png"/>
+                    <pic:cNvPicPr/>
+                  </pic:nvPicPr>
+                  <pic:blipFill>
+                    <a:blip r:embed="rId11"/>
+                    <a:stretch>
+                      <a:fillRect/>
+                    </a:stretch>
+                  </pic:blipFill>
+                  <pic:spPr>
+                    <a:xfrm>
+                      <a:off x="0" y="0"/>
+                      <a:ext cx="3888000" cy="2120727"/>
+                    </a:xfrm>
+                    <a:prstGeom prst="rect"/>
+                  </pic:spPr>
+                </pic:pic>
+              </a:graphicData>
+            </a:graphic>
+          </wp:inline>
+        </w:drawing>
+      </w:r>
+    </w:p>
+    <w:p>
+      <w:pPr>
+        <w:pStyle w:val="Comentariodeimagen"/>
+        <w:ind w:left="709" w:right="709"/>
+      </w:pPr>
+      <w:r>
+        <w:rPr>
+          <w:b/>
+        </w:rPr>
+        <w:t xml:space="preserve">Panel de conexiones. </w:t>
+      </w:r>
+      <w:r>
+        <w:rPr/>
+        <w:t xml:space="preserve">Imagen de referencia para los enlaces de acceso del ejemplo. No identifica un modelo ni una prestación ofrecida.</w:t>
       </w:r>
     </w:p>
     <w:p>
@@ -1681,7 +1738,7 @@
       <w:start w:val="1"/>
       <w:numFmt w:val="decimal"/>
       <w:pStyle w:val="Heading1"/>
-      <w:lvlText w:val="%1"/>
+      <w:lvlText w:val="%1."/>
       <w:suff w:val="space"/>
       <w:lvlJc w:val="left"/>
       <w:pPr>
@@ -1698,7 +1755,7 @@
       <w:start w:val="1"/>
       <w:numFmt w:val="decimal"/>
       <w:pStyle w:val="Heading2"/>
-      <w:lvlText w:val="%1.%2"/>
+      <w:lvlText w:val="%1.%2."/>
       <w:suff w:val="space"/>
       <w:lvlJc w:val="left"/>
       <w:lvlRestart w:val="1"/>
@@ -1716,7 +1773,7 @@
       <w:start w:val="1"/>
       <w:numFmt w:val="decimal"/>
       <w:pStyle w:val="Heading3"/>
-      <w:lvlText w:val="%1.%2.%3"/>
+      <w:lvlText w:val="%1.%2.%3."/>
       <w:suff w:val="space"/>
       <w:lvlJc w:val="left"/>
       <w:lvlRestart w:val="2"/>
@@ -1974,7 +2031,7 @@
       <w:keepLines/>
       <w:widowControl/>
       <w:spacing w:before="480" w:after="120" w:line="288" w:lineRule="auto"/>
-      <w:ind w:left="0" w:hanging="0"/>
+      <w:ind w:left="0" w:firstLine="0"/>
       <w:outlineLvl w:val="0"/>
       <w:numPr>
         <w:ilvl w:val="0"/>
@@ -2005,7 +2062,7 @@
       <w:keepLines/>
       <w:widowControl/>
       <w:spacing w:before="360" w:after="120" w:line="288" w:lineRule="auto"/>
-      <w:ind w:left="0" w:hanging="0"/>
+      <w:ind w:left="0" w:firstLine="0"/>
       <w:outlineLvl w:val="1"/>
       <w:numPr>
         <w:ilvl w:val="1"/>
@@ -2036,7 +2093,7 @@
       <w:keepLines/>
       <w:widowControl/>
       <w:spacing w:before="320" w:after="120" w:line="288" w:lineRule="auto"/>
-      <w:ind w:left="0" w:hanging="0"/>
+      <w:ind w:left="0" w:firstLine="0"/>
       <w:outlineLvl w:val="2"/>
       <w:numPr>
         <w:ilvl w:val="2"/>
@@ -13621,6 +13678,46 @@
         <w:shd w:val="clear" w:color="auto" w:fill="FBCAA2" w:themeFill="accent6" w:themeFillTint="7F"/>
       </w:tcPr>
     </w:tblStylePr>
+  </w:style>
+  <w:style w:type="paragraph" w:customStyle="1" w:styleId="Imagencentrada">
+    <w:name w:val="Imagen centrada"/>
+    <w:basedOn w:val="Normal"/>
+    <w:next w:val="Normal"/>
+    <w:pPr>
+      <w:keepNext/>
+      <w:keepLines/>
+      <w:widowControl/>
+      <w:spacing w:line="240" w:lineRule="auto" w:before="360" w:after="120"/>
+      <w:ind w:left="0" w:right="0" w:firstLine="0"/>
+      <w:jc w:val="center"/>
+    </w:pPr>
+    <w:rPr>
+      <w:rFonts w:ascii="UM Sans 2" w:hAnsi="UM Sans 2" w:cs="UM Sans 2" w:eastAsia="UM Sans 2"/>
+      <w:b w:val="0"/>
+      <w:i w:val="0"/>
+      <w:color w:val="000000"/>
+      <w:sz w:val="24"/>
+    </w:rPr>
+  </w:style>
+  <w:style w:type="paragraph" w:customStyle="1" w:styleId="Comentariodeimagen">
+    <w:name w:val="Comentario de imagen"/>
+    <w:basedOn w:val="Normal"/>
+    <w:next w:val="Normal"/>
+    <w:pPr>
+      <w:keepNext w:val="0"/>
+      <w:keepLines/>
+      <w:widowControl/>
+      <w:spacing w:line="276" w:lineRule="auto" w:before="0" w:after="480"/>
+      <w:ind w:left="0" w:right="0" w:firstLine="0"/>
+      <w:jc w:val="center"/>
+    </w:pPr>
+    <w:rPr>
+      <w:rFonts w:ascii="UM Sans 2" w:hAnsi="UM Sans 2" w:cs="UM Sans 2" w:eastAsia="UM Sans 2"/>
+      <w:b w:val="0"/>
+      <w:i w:val="0"/>
+      <w:color w:val="333333"/>
+      <w:sz w:val="21"/>
+    </w:rPr>
   </w:style>
 </w:styles>
 </file>

</xml_diff>